<commit_message>
Style all HR document templates and clean up document sharing UI
Apply consistent Calibri font, blue headings, bold merge-field values,
and 1.58in x 1.33in logo sizing across every HTML/docx HR document
template (offer letter, LOA, NDA, code of conduct, HR policies,
promotion/relieving/offboarding letters, experience letter, F&F
settlement, hardware consent, work-for-hire, and video consent forms),
fixing inconsistent spacing and sizing along the way. Add 'hybrid' as
an employment type option. Remove the manual notify checkboxes and
Send Gmail/WhatsApp buttons from the employee document list, since
Share/Download already cover that need.

Co-Authored-By: Claude Sonnet 5 <noreply@anthropic.com>
</commit_message>
<xml_diff>
--- a/backend/templates/files/appointment-letter.docx
+++ b/backend/templates/files/appointment-letter.docx
@@ -4,15 +4,15 @@
   <w:body>
     <w:p>
       <w:pPr>
-        <w:spacing w:after="240" w:before="240" w:lineRule="auto"/>
+        <w:spacing w:after="320" w:before="240" w:lineRule="auto"/>
         <w:jc w:val="center"/>
         <w:rPr>
           <w:rFonts w:ascii="Calibri" w:cs="Calibri" w:eastAsia="Calibri" w:hAnsi="Calibri"/>
           <w:b w:val="1"/>
           <w:bCs w:val="1"/>
           <w:color w:val="4a86e8"/>
-          <w:sz w:val="28"/>
-          <w:szCs w:val="28"/>
+          <w:sz w:val="32"/>
+          <w:szCs w:val="32"/>
           <w:highlight w:val="white"/>
           <w:u w:val="single"/>
         </w:rPr>
@@ -23,8 +23,8 @@
           <w:b w:val="1"/>
           <w:bCs w:val="1"/>
           <w:color w:val="4a86e8"/>
-          <w:sz w:val="28"/>
-          <w:szCs w:val="28"/>
+          <w:sz w:val="32"/>
+          <w:szCs w:val="32"/>
           <w:highlight w:val="white"/>
           <w:u w:val="single"/>
         </w:rPr>
@@ -37,7 +37,7 @@
             <wp:positionV relativeFrom="page">
               <wp:posOffset>0</wp:posOffset>
             </wp:positionV>
-            <wp:extent cx="1447800" cy="1219200"/>
+            <wp:extent cx="1444752" cy="1216152"/>
             <wp:effectExtent b="25400" l="25400" r="25400" t="25400"/>
             <wp:wrapNone/>
             <wp:docPr id="7" name="image2.png"/>
@@ -58,7 +58,7 @@
                   <pic:spPr>
                     <a:xfrm>
                       <a:off x="0" y="0"/>
-                      <a:ext cx="1447800" cy="1219200"/>
+                      <a:ext cx="1444752" cy="1216152"/>
                     </a:xfrm>
                     <a:prstGeom prst="rect"/>
                     <a:ln w="25400">
@@ -80,8 +80,8 @@
           <w:b w:val="1"/>
           <w:bCs w:val="1"/>
           <w:color w:val="4a86e8"/>
-          <w:sz w:val="28"/>
-          <w:szCs w:val="28"/>
+          <w:sz w:val="32"/>
+          <w:szCs w:val="32"/>
           <w:highlight w:val="white"/>
           <w:u w:val="single"/>
           <w:rtl w:val="0"/>
@@ -91,15 +91,23 @@
     </w:p>
     <w:p>
       <w:pPr>
-        <w:spacing w:after="240" w:before="240" w:lineRule="auto"/>
-        <w:jc w:val="right"/>
+        <w:tabs>
+          <w:tab w:val="right" w:pos="9029"/>
+        </w:tabs>
+        <w:spacing w:after="280" w:before="240" w:lineRule="auto"/>
         <w:rPr>
           <w:rFonts w:ascii="Calibri" w:cs="Calibri" w:eastAsia="Calibri" w:hAnsi="Calibri"/>
-          <w:b w:val="1"/>
-          <w:bCs w:val="1"/>
           <w:highlight w:val="white"/>
         </w:rPr>
       </w:pPr>
+      <w:r>
+        <w:rPr>
+          <w:rFonts w:ascii="Calibri" w:cs="Calibri" w:eastAsia="Calibri" w:hAnsi="Calibri"/>
+          <w:highlight w:val="white"/>
+          <w:rtl w:val="0"/>
+        </w:rPr>
+        <w:t xml:space="preserve">To,</w:t>
+      </w:r>
       <w:r>
         <w:rPr>
           <w:rFonts w:ascii="Calibri" w:cs="Calibri" w:eastAsia="Calibri" w:hAnsi="Calibri"/>
@@ -108,30 +116,13 @@
           <w:highlight w:val="white"/>
           <w:rtl w:val="0"/>
         </w:rPr>
+        <w:tab/>
         <w:t xml:space="preserve">Date: {todayDate}</w:t>
       </w:r>
     </w:p>
     <w:p>
       <w:pPr>
-        <w:spacing w:after="240" w:before="240" w:lineRule="auto"/>
-        <w:jc w:val="both"/>
-        <w:rPr>
-          <w:rFonts w:ascii="Calibri" w:cs="Calibri" w:eastAsia="Calibri" w:hAnsi="Calibri"/>
-          <w:highlight w:val="white"/>
-        </w:rPr>
-      </w:pPr>
-      <w:r>
-        <w:rPr>
-          <w:rFonts w:ascii="Calibri" w:cs="Calibri" w:eastAsia="Calibri" w:hAnsi="Calibri"/>
-          <w:highlight w:val="white"/>
-          <w:rtl w:val="0"/>
-        </w:rPr>
-        <w:t xml:space="preserve">To,</w:t>
-      </w:r>
-    </w:p>
-    <w:p>
-      <w:pPr>
-        <w:spacing w:line="300" w:lineRule="auto"/>
+        <w:spacing w:after="60" w:before="0" w:lineRule="auto"/>
         <w:jc w:val="both"/>
         <w:rPr>
           <w:rFonts w:ascii="Calibri" w:cs="Calibri" w:eastAsia="Calibri" w:hAnsi="Calibri"/>
@@ -142,14 +133,16 @@
       <w:r>
         <w:rPr>
           <w:rFonts w:ascii="Calibri" w:cs="Calibri" w:eastAsia="Calibri" w:hAnsi="Calibri"/>
+          <w:b w:val="1"/>
+          <w:bCs w:val="1"/>
           <w:rtl w:val="0"/>
         </w:rPr>
-        <w:t xml:space="preserve">Dear {employeeName}</w:t>
+        <w:t xml:space="preserve">{employeeName}</w:t>
       </w:r>
     </w:p>
     <w:p>
       <w:pPr>
-        <w:spacing w:line="300" w:lineRule="auto"/>
+        <w:spacing w:after="200" w:before="0" w:lineRule="auto"/>
         <w:jc w:val="both"/>
         <w:rPr>
           <w:rFonts w:ascii="Calibri" w:cs="Calibri" w:eastAsia="Calibri" w:hAnsi="Calibri"/>
@@ -162,6 +155,22 @@
           <w:rtl w:val="0"/>
         </w:rPr>
         <w:t xml:space="preserve">{employeeAddress}</w:t>
+      </w:r>
+    </w:p>
+    <w:p>
+      <w:pPr>
+        <w:spacing w:after="200" w:before="0" w:lineRule="auto"/>
+        <w:jc w:val="both"/>
+        <w:rPr>
+          <w:rFonts w:ascii="Calibri" w:cs="Calibri" w:eastAsia="Calibri" w:hAnsi="Calibri"/>
+        </w:rPr>
+      </w:pPr>
+      <w:r>
+        <w:rPr>
+          <w:rFonts w:ascii="Calibri" w:cs="Calibri" w:eastAsia="Calibri" w:hAnsi="Calibri"/>
+          <w:rtl w:val="0"/>
+        </w:rPr>
+        <w:t xml:space="preserve">Dear {employeeName},</w:t>
       </w:r>
     </w:p>
     <w:p>
@@ -186,7 +195,7 @@
     </w:p>
     <w:p>
       <w:pPr>
-        <w:spacing w:after="240" w:before="240" w:lineRule="auto"/>
+        <w:spacing w:after="220" w:before="240" w:lineRule="auto"/>
         <w:jc w:val="both"/>
         <w:rPr>
           <w:rFonts w:ascii="Calibri" w:cs="Calibri" w:eastAsia="Calibri" w:hAnsi="Calibri"/>
@@ -228,7 +237,51 @@
           <w:highlight w:val="white"/>
           <w:rtl w:val="0"/>
         </w:rPr>
-        <w:t xml:space="preserve">Position &amp; Joining Date: You will join as {designation} effective from {dateOfJoining}</w:t>
+        <w:t xml:space="preserve">Position &amp; Joining Date: </w:t>
+      </w:r>
+      <w:r>
+        <w:rPr>
+          <w:rFonts w:ascii="Calibri" w:cs="Calibri" w:eastAsia="Calibri" w:hAnsi="Calibri"/>
+          <w:highlight w:val="white"/>
+          <w:rtl w:val="0"/>
+        </w:rPr>
+        <w:t xml:space="preserve">You will join as </w:t>
+      </w:r>
+      <w:r>
+        <w:rPr>
+          <w:rFonts w:ascii="Calibri" w:cs="Calibri" w:eastAsia="Calibri" w:hAnsi="Calibri"/>
+          <w:b w:val="1"/>
+          <w:bCs w:val="1"/>
+          <w:highlight w:val="white"/>
+          <w:rtl w:val="0"/>
+        </w:rPr>
+        <w:t xml:space="preserve">{designation}</w:t>
+      </w:r>
+      <w:r>
+        <w:rPr>
+          <w:rFonts w:ascii="Calibri" w:cs="Calibri" w:eastAsia="Calibri" w:hAnsi="Calibri"/>
+          <w:highlight w:val="white"/>
+          <w:rtl w:val="0"/>
+        </w:rPr>
+        <w:t xml:space="preserve"> effective from </w:t>
+      </w:r>
+      <w:r>
+        <w:rPr>
+          <w:rFonts w:ascii="Calibri" w:cs="Calibri" w:eastAsia="Calibri" w:hAnsi="Calibri"/>
+          <w:b w:val="1"/>
+          <w:bCs w:val="1"/>
+          <w:highlight w:val="white"/>
+          <w:rtl w:val="0"/>
+        </w:rPr>
+        <w:t xml:space="preserve">{dateOfJoining}</w:t>
+      </w:r>
+      <w:r>
+        <w:rPr>
+          <w:rFonts w:ascii="Calibri" w:cs="Calibri" w:eastAsia="Calibri" w:hAnsi="Calibri"/>
+          <w:highlight w:val="white"/>
+          <w:rtl w:val="0"/>
+        </w:rPr>
+        <w:t xml:space="preserve">.</w:t>
       </w:r>
     </w:p>
     <w:p>
@@ -378,7 +431,30 @@
           <w:color w:val="4a86e8"/>
           <w:rtl w:val="0"/>
         </w:rPr>
-        <w:t xml:space="preserve">Work Location &amp; Timings: Your primary work location will be {workLocation}. The regular office timings are 9:30 AM - 6:30 PM, subject to company policy.</w:t>
+        <w:t xml:space="preserve">Work Location &amp; Timings: </w:t>
+      </w:r>
+      <w:r>
+        <w:rPr>
+          <w:rFonts w:ascii="Calibri" w:cs="Calibri" w:eastAsia="Calibri" w:hAnsi="Calibri"/>
+          <w:rtl w:val="0"/>
+        </w:rPr>
+        <w:t xml:space="preserve">Your primary work location will be </w:t>
+      </w:r>
+      <w:r>
+        <w:rPr>
+          <w:rFonts w:ascii="Calibri" w:cs="Calibri" w:eastAsia="Calibri" w:hAnsi="Calibri"/>
+          <w:b w:val="1"/>
+          <w:bCs w:val="1"/>
+          <w:rtl w:val="0"/>
+        </w:rPr>
+        <w:t xml:space="preserve">{workLocation}</w:t>
+      </w:r>
+      <w:r>
+        <w:rPr>
+          <w:rFonts w:ascii="Calibri" w:cs="Calibri" w:eastAsia="Calibri" w:hAnsi="Calibri"/>
+          <w:rtl w:val="0"/>
+        </w:rPr>
+        <w:t xml:space="preserve">. The regular office timings are 9:30 AM - 6:30 PM, subject to company policy.</w:t>
       </w:r>
     </w:p>
     <w:p>
@@ -427,7 +503,7 @@
             <wp:positionV relativeFrom="page">
               <wp:posOffset>0</wp:posOffset>
             </wp:positionV>
-            <wp:extent cx="1447800" cy="1219200"/>
+            <wp:extent cx="1444752" cy="1216152"/>
             <wp:effectExtent b="25400" l="25400" r="25400" t="25400"/>
             <wp:wrapNone/>
             <wp:docPr id="14" name="image1.png"/>
@@ -448,7 +524,7 @@
                   <pic:spPr>
                     <a:xfrm>
                       <a:off x="0" y="0"/>
-                      <a:ext cx="1447800" cy="1219200"/>
+                      <a:ext cx="1444752" cy="1216152"/>
                     </a:xfrm>
                     <a:prstGeom prst="rect"/>
                     <a:ln w="25400">
@@ -588,206 +664,237 @@
         <w:t xml:space="preserve">I have read and understood the contents of the offer letter and exhibits hereto and accept all the terms and conditions of this letter.</w:t>
       </w:r>
     </w:p>
-    <w:p>
-      <w:pPr>
-        <w:spacing w:after="240" w:before="240" w:lineRule="auto"/>
-        <w:jc w:val="both"/>
-        <w:rPr>
-          <w:rFonts w:ascii="Calibri" w:cs="Calibri" w:eastAsia="Calibri" w:hAnsi="Calibri"/>
-          <w:b w:val="1"/>
-          <w:bCs w:val="1"/>
-        </w:rPr>
-      </w:pPr>
-      <w:r>
-        <w:rPr>
-          <w:rFonts w:ascii="Calibri" w:cs="Calibri" w:eastAsia="Calibri" w:hAnsi="Calibri"/>
-          <w:b w:val="1"/>
-          <w:bCs w:val="1"/>
-          <w:rtl w:val="0"/>
-        </w:rPr>
-        <w:t xml:space="preserve">For GO-TO Friend Pvt. Ltd.,</w:t>
-      </w:r>
-    </w:p>
-    <w:p>
-      <w:pPr>
-        <w:spacing w:after="240" w:before="240" w:lineRule="auto"/>
-        <w:jc w:val="both"/>
-        <w:rPr>
-          <w:rFonts w:ascii="Calibri" w:cs="Calibri" w:eastAsia="Calibri" w:hAnsi="Calibri"/>
-        </w:rPr>
-      </w:pPr>
-      <w:r>
-        <w:rPr>
-          <w:rFonts w:ascii="Calibri" w:cs="Calibri" w:eastAsia="Calibri" w:hAnsi="Calibri"/>
-          <w:b w:val="1"/>
-          <w:bCs w:val="1"/>
-        </w:rPr>
-        <w:drawing>
-          <wp:anchor allowOverlap="1" behindDoc="1" distB="0" distT="0" distL="0" distR="0" hidden="0" layoutInCell="1" locked="0" relativeHeight="0" simplePos="0">
-            <wp:simplePos x="0" y="0"/>
-            <wp:positionH relativeFrom="page">
-              <wp:posOffset>6120000</wp:posOffset>
-            </wp:positionH>
-            <wp:positionV relativeFrom="page">
-              <wp:posOffset>0</wp:posOffset>
-            </wp:positionV>
-            <wp:extent cx="1447800" cy="1219200"/>
-            <wp:effectExtent b="25400" l="25400" r="25400" t="25400"/>
-            <wp:wrapNone/>
-            <wp:docPr id="1" name="image1.png"/>
-            <a:graphic>
-              <a:graphicData uri="http://schemas.openxmlformats.org/drawingml/2006/picture">
-                <pic:pic>
-                  <pic:nvPicPr>
-                    <pic:cNvPr id="0" name="image1.png"/>
-                    <pic:cNvPicPr preferRelativeResize="0"/>
-                  </pic:nvPicPr>
-                  <pic:blipFill>
-                    <a:blip r:embed="rId6"/>
-                    <a:srcRect b="19159" l="16964" r="15179" t="21028"/>
-                    <a:stretch>
-                      <a:fillRect/>
-                    </a:stretch>
-                  </pic:blipFill>
-                  <pic:spPr>
-                    <a:xfrm>
-                      <a:off x="0" y="0"/>
-                      <a:ext cx="1447800" cy="1219200"/>
-                    </a:xfrm>
-                    <a:prstGeom prst="rect"/>
-                    <a:ln w="25400">
-                      <a:solidFill>
-                        <a:srgbClr val="FFFFFF"/>
-                      </a:solidFill>
-                      <a:prstDash val="solid"/>
-                    </a:ln>
-                  </pic:spPr>
-                </pic:pic>
-              </a:graphicData>
-            </a:graphic>
-          </wp:anchor>
-        </w:drawing>
-      </w:r>
-      <w:r>
-        <w:rPr>
-          <w:rtl w:val="0"/>
-        </w:rPr>
-      </w:r>
-    </w:p>
-    <w:p>
-      <w:pPr>
-        <w:spacing w:line="300" w:lineRule="auto"/>
-        <w:jc w:val="both"/>
-        <w:rPr>
-          <w:rFonts w:ascii="Calibri" w:cs="Calibri" w:eastAsia="Calibri" w:hAnsi="Calibri"/>
-          <w:b w:val="1"/>
-          <w:bCs w:val="1"/>
-        </w:rPr>
-      </w:pPr>
-      <w:r>
-        <w:rPr>
-          <w:rFonts w:ascii="Calibri" w:cs="Calibri" w:eastAsia="Calibri" w:hAnsi="Calibri"/>
-          <w:b w:val="1"/>
-          <w:bCs w:val="1"/>
-          <w:rtl w:val="0"/>
-        </w:rPr>
-        <w:t xml:space="preserve">Juhika Paradkar</w:t>
-      </w:r>
-    </w:p>
-    <w:p>
-      <w:pPr>
-        <w:spacing w:line="300" w:lineRule="auto"/>
-        <w:jc w:val="both"/>
-        <w:rPr>
-          <w:rFonts w:ascii="Calibri" w:cs="Calibri" w:eastAsia="Calibri" w:hAnsi="Calibri"/>
-          <w:b w:val="1"/>
-          <w:bCs w:val="1"/>
-        </w:rPr>
-      </w:pPr>
-      <w:r>
-        <w:rPr>
-          <w:rFonts w:ascii="Calibri" w:cs="Calibri" w:eastAsia="Calibri" w:hAnsi="Calibri"/>
-          <w:b w:val="1"/>
-          <w:bCs w:val="1"/>
-          <w:rtl w:val="0"/>
-        </w:rPr>
-        <w:t xml:space="preserve">HR Executive</w:t>
-      </w:r>
-    </w:p>
-    <w:p>
-      <w:pPr>
-        <w:spacing w:line="300" w:lineRule="auto"/>
-        <w:jc w:val="both"/>
-        <w:rPr>
-          <w:rFonts w:ascii="Calibri" w:cs="Calibri" w:eastAsia="Calibri" w:hAnsi="Calibri"/>
-          <w:b w:val="1"/>
-          <w:bCs w:val="1"/>
-        </w:rPr>
-      </w:pPr>
-      <w:r>
-        <w:rPr>
-          <w:rFonts w:ascii="Calibri" w:cs="Calibri" w:eastAsia="Calibri" w:hAnsi="Calibri"/>
-          <w:b w:val="1"/>
-          <w:bCs w:val="1"/>
-          <w:rtl w:val="0"/>
-        </w:rPr>
-        <w:t xml:space="preserve">For GO-TO Friend Pvt. Ltd.</w:t>
-      </w:r>
-    </w:p>
-    <w:p>
-      <w:pPr>
-        <w:spacing w:line="300" w:lineRule="auto"/>
-        <w:jc w:val="both"/>
-        <w:rPr>
-          <w:rFonts w:ascii="Calibri" w:cs="Calibri" w:eastAsia="Calibri" w:hAnsi="Calibri"/>
-        </w:rPr>
-      </w:pPr>
-      <w:r>
-        <w:rPr>
-          <w:rtl w:val="0"/>
-        </w:rPr>
-      </w:r>
-    </w:p>
-    <w:p>
-      <w:pPr>
-        <w:spacing w:line="300" w:lineRule="auto"/>
-        <w:jc w:val="both"/>
-        <w:rPr>
-          <w:rFonts w:ascii="Calibri" w:cs="Calibri" w:eastAsia="Calibri" w:hAnsi="Calibri"/>
-        </w:rPr>
-      </w:pPr>
-      <w:r>
-        <w:rPr>
-          <w:rFonts w:ascii="Calibri" w:cs="Calibri" w:eastAsia="Calibri" w:hAnsi="Calibri"/>
-          <w:color w:val="4a86e8"/>
-          <w:rtl w:val="0"/>
-        </w:rPr>
-        <w:t xml:space="preserve">Candidate Acceptance: </w:t>
-      </w:r>
-      <w:r>
-        <w:rPr>
-          <w:rFonts w:ascii="Calibri" w:cs="Calibri" w:eastAsia="Calibri" w:hAnsi="Calibri"/>
-          <w:rtl w:val="0"/>
-        </w:rPr>
-        <w:t xml:space="preserve">I have read and understand the terms of this offer and hereby accept employment with </w:t>
-      </w:r>
-      <w:r>
-        <w:rPr>
-          <w:rFonts w:ascii="Calibri" w:cs="Calibri" w:eastAsia="Calibri" w:hAnsi="Calibri"/>
-          <w:b w:val="1"/>
-          <w:bCs w:val="1"/>
-          <w:rtl w:val="0"/>
-        </w:rPr>
-        <w:t xml:space="preserve">GO-TO Friend Pvt. Ltd.</w:t>
-      </w:r>
-      <w:r>
-        <w:rPr>
-          <w:rFonts w:ascii="Calibri" w:cs="Calibri" w:eastAsia="Calibri" w:hAnsi="Calibri"/>
-          <w:rtl w:val="0"/>
-        </w:rPr>
-        <w:t xml:space="preserve"> under the conditions described above.</w:t>
-      </w:r>
-    </w:p>
+    <w:tbl>
+      <w:tblPr>
+        <w:tblW w:w="9029" w:type="dxa"/>
+        <w:tblBorders>
+          <w:top w:val="none" w:sz="0" w:space="0" w:color="auto"/>
+          <w:left w:val="none" w:sz="0" w:space="0" w:color="auto"/>
+          <w:bottom w:val="none" w:sz="0" w:space="0" w:color="auto"/>
+          <w:right w:val="none" w:sz="0" w:space="0" w:color="auto"/>
+          <w:insideH w:val="none" w:sz="0" w:space="0" w:color="auto"/>
+          <w:insideV w:val="none" w:sz="0" w:space="0" w:color="auto"/>
+        </w:tblBorders>
+        <w:tblLayout w:type="fixed"/>
+        <w:tblCellMar>
+          <w:left w:w="0" w:type="dxa"/>
+          <w:right w:w="0" w:type="dxa"/>
+        </w:tblCellMar>
+      </w:tblPr>
+      <w:tblGrid>
+        <w:gridCol w:w="4200"/>
+        <w:gridCol w:w="4829"/>
+      </w:tblGrid>
+      <w:tr>
+        <w:tc>
+          <w:tcPr>
+            <w:tcW w:w="4200" w:type="dxa"/>
+            <w:tcMar>
+              <w:right w:w="200" w:type="dxa"/>
+            </w:tcMar>
+            <w:vAlign w:val="top"/>
+          </w:tcPr>
+          <w:p>
+            <w:pPr>
+              <w:spacing w:after="850" w:before="0" w:lineRule="auto"/>
+              <w:rPr>
+                <w:rFonts w:ascii="Calibri" w:cs="Calibri" w:eastAsia="Calibri" w:hAnsi="Calibri"/>
+                <w:b w:val="1"/>
+                <w:bCs w:val="1"/>
+                <w:sz w:val="20"/>
+                <w:szCs w:val="20"/>
+              </w:rPr>
+            </w:pPr>
+            <w:r>
+              <w:rPr>
+                <w:rFonts w:ascii="Calibri" w:cs="Calibri" w:eastAsia="Calibri" w:hAnsi="Calibri"/>
+                <w:b w:val="1"/>
+                <w:bCs w:val="1"/>
+                <w:sz w:val="20"/>
+                <w:szCs w:val="20"/>
+                <w:rtl w:val="0"/>
+              </w:rPr>
+              <w:t xml:space="preserve">For GO-TO Friend Pvt. Ltd.,</w:t>
+            </w:r>
+          </w:p>
+          <w:p>
+            <w:pPr>
+              <w:spacing w:after="0" w:before="0" w:lineRule="auto"/>
+              <w:rPr>
+                <w:rFonts w:ascii="Calibri" w:cs="Calibri" w:eastAsia="Calibri" w:hAnsi="Calibri"/>
+                <w:b w:val="1"/>
+                <w:bCs w:val="1"/>
+                <w:sz w:val="20"/>
+                <w:szCs w:val="20"/>
+              </w:rPr>
+            </w:pPr>
+            <w:r>
+              <w:rPr>
+                <w:rFonts w:ascii="Calibri" w:cs="Calibri" w:eastAsia="Calibri" w:hAnsi="Calibri"/>
+                <w:b w:val="1"/>
+                <w:bCs w:val="1"/>
+                <w:sz w:val="20"/>
+                <w:szCs w:val="20"/>
+                <w:rtl w:val="0"/>
+              </w:rPr>
+              <w:t xml:space="preserve">{hrExecutiveName}</w:t>
+            </w:r>
+          </w:p>
+          <w:p>
+            <w:pPr>
+              <w:spacing w:after="0" w:before="0" w:lineRule="auto"/>
+              <w:rPr>
+                <w:rFonts w:ascii="Calibri" w:cs="Calibri" w:eastAsia="Calibri" w:hAnsi="Calibri"/>
+                <w:b w:val="1"/>
+                <w:bCs w:val="1"/>
+                <w:sz w:val="20"/>
+                <w:szCs w:val="20"/>
+              </w:rPr>
+            </w:pPr>
+            <w:r>
+              <w:rPr>
+                <w:rFonts w:ascii="Calibri" w:cs="Calibri" w:eastAsia="Calibri" w:hAnsi="Calibri"/>
+                <w:b w:val="1"/>
+                <w:bCs w:val="1"/>
+                <w:sz w:val="20"/>
+                <w:szCs w:val="20"/>
+                <w:rtl w:val="0"/>
+              </w:rPr>
+              <w:t xml:space="preserve">HR Executive</w:t>
+            </w:r>
+          </w:p>
+        </w:tc>
+        <w:tc>
+          <w:tcPr>
+            <w:tcW w:w="4829" w:type="dxa"/>
+            <w:vAlign w:val="top"/>
+          </w:tcPr>
+          <w:p>
+            <w:pPr>
+              <w:spacing w:after="60" w:before="0" w:lineRule="auto"/>
+              <w:rPr>
+                <w:rFonts w:ascii="Calibri" w:cs="Calibri" w:eastAsia="Calibri" w:hAnsi="Calibri"/>
+                <w:b w:val="1"/>
+                <w:bCs w:val="1"/>
+                <w:sz w:val="20"/>
+                <w:szCs w:val="20"/>
+              </w:rPr>
+            </w:pPr>
+            <w:r>
+              <w:rPr>
+                <w:rFonts w:ascii="Calibri" w:cs="Calibri" w:eastAsia="Calibri" w:hAnsi="Calibri"/>
+                <w:b w:val="1"/>
+                <w:bCs w:val="1"/>
+                <w:sz w:val="20"/>
+                <w:szCs w:val="20"/>
+                <w:rtl w:val="0"/>
+              </w:rPr>
+              <w:t xml:space="preserve">Candidate Acceptance:</w:t>
+            </w:r>
+          </w:p>
+          <w:p w14:paraId="00000101B">
+            <w:pPr>
+              <w:spacing w:after="350" w:before="0" w:lineRule="auto"/>
+              <w:rPr>
+                <w:rFonts w:ascii="Calibri" w:cs="Calibri" w:eastAsia="Calibri" w:hAnsi="Calibri"/>
+                <w:sz w:val="20"/>
+                <w:szCs w:val="20"/>
+              </w:rPr>
+            </w:pPr>
+            <w:r>
+              <w:rPr>
+                <w:rFonts w:ascii="Calibri" w:cs="Calibri" w:eastAsia="Calibri" w:hAnsi="Calibri"/>
+                <w:sz w:val="20"/>
+                <w:szCs w:val="20"/>
+                <w:rtl w:val="0"/>
+              </w:rPr>
+              <w:t xml:space="preserve">I have read and understand the terms of this offer and hereby accept employment with </w:t>
+            </w:r>
+            <w:r>
+              <w:rPr>
+                <w:rFonts w:ascii="Calibri" w:cs="Calibri" w:eastAsia="Calibri" w:hAnsi="Calibri"/>
+                <w:b w:val="1"/>
+                <w:bCs w:val="1"/>
+                <w:sz w:val="20"/>
+                <w:szCs w:val="20"/>
+                <w:rtl w:val="0"/>
+              </w:rPr>
+              <w:t xml:space="preserve">GO-TO Friend Pvt. Ltd.</w:t>
+            </w:r>
+            <w:r>
+              <w:rPr>
+                <w:rFonts w:ascii="Calibri" w:cs="Calibri" w:eastAsia="Calibri" w:hAnsi="Calibri"/>
+                <w:sz w:val="20"/>
+                <w:szCs w:val="20"/>
+                <w:rtl w:val="0"/>
+              </w:rPr>
+              <w:t xml:space="preserve"> under the conditions described above.</w:t>
+            </w:r>
+          </w:p>
+          <w:p>
+            <w:pPr>
+              <w:spacing w:after="0" w:before="0" w:lineRule="auto"/>
+              <w:rPr>
+                <w:rFonts w:ascii="Calibri" w:cs="Calibri" w:eastAsia="Calibri" w:hAnsi="Calibri"/>
+                <w:sz w:val="20"/>
+                <w:szCs w:val="20"/>
+              </w:rPr>
+            </w:pPr>
+            <w:r>
+              <w:rPr>
+                <w:rFonts w:ascii="Calibri" w:cs="Calibri" w:eastAsia="Calibri" w:hAnsi="Calibri"/>
+                <w:sz w:val="20"/>
+                <w:szCs w:val="20"/>
+                <w:rtl w:val="0"/>
+              </w:rPr>
+              <w:t xml:space="preserve">___________________________</w:t>
+            </w:r>
+          </w:p>
+          <w:p>
+            <w:pPr>
+              <w:spacing w:after="0" w:before="40" w:lineRule="auto"/>
+              <w:rPr>
+                <w:rFonts w:ascii="Calibri" w:cs="Calibri" w:eastAsia="Calibri" w:hAnsi="Calibri"/>
+                <w:b w:val="1"/>
+                <w:bCs w:val="1"/>
+                <w:sz w:val="20"/>
+                <w:szCs w:val="20"/>
+              </w:rPr>
+            </w:pPr>
+            <w:r>
+              <w:rPr>
+                <w:rFonts w:ascii="Calibri" w:cs="Calibri" w:eastAsia="Calibri" w:hAnsi="Calibri"/>
+                <w:b w:val="1"/>
+                <w:bCs w:val="1"/>
+                <w:sz w:val="20"/>
+                <w:szCs w:val="20"/>
+                <w:rtl w:val="0"/>
+              </w:rPr>
+              <w:t xml:space="preserve">{employeeName}</w:t>
+            </w:r>
+          </w:p>
+          <w:p>
+            <w:pPr>
+              <w:spacing w:after="0" w:before="40" w:lineRule="auto"/>
+              <w:rPr>
+                <w:rFonts w:ascii="Calibri" w:cs="Calibri" w:eastAsia="Calibri" w:hAnsi="Calibri"/>
+                <w:sz w:val="20"/>
+                <w:szCs w:val="20"/>
+              </w:rPr>
+            </w:pPr>
+            <w:r>
+              <w:rPr>
+                <w:rFonts w:ascii="Calibri" w:cs="Calibri" w:eastAsia="Calibri" w:hAnsi="Calibri"/>
+                <w:sz w:val="20"/>
+                <w:szCs w:val="20"/>
+                <w:rtl w:val="0"/>
+              </w:rPr>
+              <w:t xml:space="preserve">Date: ____________</w:t>
+            </w:r>
+          </w:p>
+        </w:tc>
+      </w:tr>
+    </w:tbl>
     <w:p>
       <w:pPr>
         <w:rPr/>
@@ -5810,7 +5917,7 @@
   <w:docDefaults>
     <w:rPrDefault>
       <w:rPr>
-        <w:rFonts w:ascii="Arial" w:cs="Arial" w:eastAsia="Arial" w:hAnsi="Arial"/>
+        <w:rFonts w:ascii="Calibri" w:cs="Calibri" w:eastAsia="Calibri" w:hAnsi="Calibri"/>
         <w:sz w:val="22"/>
         <w:szCs w:val="22"/>
         <w:lang w:val="en_GB"/>
@@ -5962,7 +6069,7 @@
       <w:spacing w:after="320" w:before="0" w:lineRule="auto"/>
     </w:pPr>
     <w:rPr>
-      <w:rFonts w:ascii="Arial" w:cs="Arial" w:eastAsia="Arial" w:hAnsi="Arial"/>
+      <w:rFonts w:ascii="Calibri" w:cs="Calibri" w:eastAsia="Calibri" w:hAnsi="Calibri"/>
       <w:i w:val="0"/>
       <w:iCs w:val="0"/>
       <w:color w:val="666666"/>

</xml_diff>